<commit_message>
Critical-review fixes: remove dead hardcoded content block; complete data availability; species name
- Remove ~500-line dead duplicate content block (stale hardcoded stats,
  old numbered-citation style) fully overwritten by revised_content.* at import;
  eliminates hardcoded numbers from the public-synced script
- Data Availability now cites ancient (Iasi/Dryad) and O2 (Ensembl/Ohashi) sources
  with persistent identifiers, per AHG data-availability policy
- Add scientific name (Homo neanderthalensis) at first mention per AHG species-name rule

Co-Authored-By: Tatsuki Onishi <bougtoir@gmail.com>
</commit_message>
<xml_diff>
--- a/denisovan-archaic-dna-analysis/docs/ahg_submission/manuscript_ahg.docx
+++ b/denisovan-archaic-dna-analysis/docs/ahg_submission/manuscript_ahg.docx
@@ -111,7 +111,7 @@
           <w:i w:val="0"/>
           <w:sz w:val="24"/>
         </w:rPr>
-        <w:t>Genomic comparisons established gene flow from Neanderthals and Denisovans into ancestors of present-day populations outside Africa (Green et al. 2010; Reich et al. 2010). The amount and genomic distribution of introgressed sequence vary among populations because of demographic history, drift, selection, and multiple introgression histories (Sankararaman et al. 2014; Sankararaman et al. 2016; Jacobs et al. 2019). These differences invite a recurring style of inference in which shared archaic segments, often at a focal locus such as the ABO blood-group gene, are read as evidence of a special connection between two populations or of a particular migration route (Calafell et al. 2008; Halverson and Bolnick 2008; Condemi et al. 2021).</w:t>
+        <w:t>Genomic comparisons established gene flow from Neanderthals (Homo neanderthalensis) and Denisovans into ancestors of present-day populations outside Africa (Green et al. 2010; Reich et al. 2010). The amount and genomic distribution of introgressed sequence vary among populations because of demographic history, drift, selection, and multiple introgression histories (Sankararaman et al. 2014; Sankararaman et al. 2016; Jacobs et al. 2019). These differences invite a recurring style of inference in which shared archaic segments, often at a focal locus such as the ABO blood-group gene, are read as evidence of a special connection between two populations or of a particular migration route (Calafell et al. 2008; Halverson and Bolnick 2008; Condemi et al. 2021).</w:t>
       </w:r>
     </w:p>
     <w:p>
@@ -681,7 +681,7 @@
     </w:p>
     <w:p>
       <w:r>
-        <w:t>Analysis scripts, aggregate derived data, figures, and document-generation code are available at https://github.com/bougtoir/denisovan-archaic-dna-analysis and will be fixed as release ahg-submission-2026-07 before submission. The source hmmix segment calls are available from Zenodo record 14136628 (https://doi.org/10.5281/zenodo.14136628). Raw-file SHA-256 checksums and all analysis parameters are included in analysis_provenance.json.</w:t>
+        <w:t>Analysis scripts, aggregate derived data, figures, and document-generation code are available at https://github.com/bougtoir/denisovan-archaic-dna-analysis and will be fixed as release ahg-submission-2026-07 before submission. The source hmmix segment calls are available from Zenodo record 14136628 (https://doi.org/10.5281/zenodo.14136628). The ancient ABO-window observations were derived from the public Neanderthal-segment catalogue of Iasi et al. (2024), archived at Dryad (https://doi.org/10.5061/dryad.zw3r228gg); O2 subtype-defining allele frequencies were obtained from the Ensembl Variation application programming interface and from Ohashi et al. (2006). Raw-file SHA-256 checksums and all analysis parameters are included in analysis_provenance.json and ancient_abo_provenance.json.</w:t>
       </w:r>
     </w:p>
     <w:p>

</xml_diff>

<commit_message>
AHG revision: negative-test framing, ABO to supplement, remove schematic figures, MRQAP residual justification, keyword and author-name fixes
Co-Authored-By: Tatsuki Onishi <bougtoir@gmail.com>
</commit_message>
<xml_diff>
--- a/denisovan-archaic-dna-analysis/docs/ahg_submission/manuscript_ahg.docx
+++ b/denisovan-archaic-dna-analysis/docs/ahg_submission/manuscript_ahg.docx
@@ -34,7 +34,7 @@
         <w:rPr>
           <w:b/>
         </w:rPr>
-        <w:t>Onishi Tatsuki</w:t>
+        <w:t>ONISHI TATSUKI</w:t>
       </w:r>
     </w:p>
     <w:p>
@@ -74,7 +74,7 @@
         <w:spacing w:line="360" w:lineRule="auto"/>
       </w:pPr>
       <w:r>
-        <w:t>Archaic-like segments near focal loci such as the ABO blood-group gene are often read as evidence of special population connections or migration routes, yet such readings are rarely tested against a genome-wide baseline that respects the dependence structure of pairwise data. We built a reproducible baseline for population-level archaic-segment sharing and used it as a negative control. High-confidence Neanderthal and Denisovan introgression calls from 3,134 individuals in 66 populations were summarised in 500-kilobase windows, and profile similarity was computed for 2,145 population pairs. Distance associations and pair-level outliers were assessed with population-label permutation tests and false-discovery-rate control. Profile similarity declined with geographic distance for Neanderthal (r=-0.497) and Denisovan (r=-0.462) segments, with partial distance correlations of -0.369 and -0.326 and permutation P values of 0.0001 and 0.0002. No non-admixed pair reached both a residual above two standard deviations and a false-discovery rate below 0.10, and a prespecified ABO-window scan showed no route-level signal. Population-level archaic-segment sharing reflects broad geographic structure but supports neither exceptional population pairs nor an ABO-mediated migration history, providing a reusable baseline for evaluating focal-locus archaic claims.</w:t>
+        <w:t>Archaic-like segments near focal loci such as the ABO blood-group gene are often read as evidence of special population connections or migration routes, yet such readings are rarely tested against a genome-wide baseline that respects the dependence structure of pairwise data. We built a reproducible baseline for population-level archaic-segment sharing and used it as a well-powered negative test of exceptional-connection and focal-locus claims. High-confidence Neanderthal and Denisovan introgression calls from 3,134 individuals in 66 populations were summarised in 500-kilobase windows, and profile similarity was computed for 2,145 population pairs. Distance associations and pair-level outliers were assessed with population-label permutation tests and false-discovery-rate control. Profile similarity declined with geographic distance for Neanderthal (r=-0.497) and Denisovan (r=-0.462) segments, with partial distance correlations of -0.369 and -0.326 and permutation P values of 0.0001 and 0.0002. No non-admixed pair reached both a residual above two standard deviations and a false-discovery rate below 0.10, and a prespecified ABO-window scan showed no route-level signal. Population-level archaic-segment sharing reflects broad geographic structure but supports neither exceptional population pairs nor an ABO-mediated migration history, providing a reusable baseline for evaluating focal-locus archaic claims.</w:t>
       </w:r>
     </w:p>
     <w:p>
@@ -85,7 +85,7 @@
         <w:t xml:space="preserve">Keywords: </w:t>
       </w:r>
       <w:r>
-        <w:t>ABO Blood-Group System; Gene Flow; Genetics, Population; Human Migration; Neanderthals</w:t>
+        <w:t>ABO Blood-Group System; Gene Flow; Genetics, Population; Models, Statistical; Neanderthals</w:t>
       </w:r>
     </w:p>
     <w:p>
@@ -137,7 +137,7 @@
           <w:i w:val="0"/>
           <w:sz w:val="24"/>
         </w:rPr>
-        <w:t>We build such a baseline and treat it as a negative control. Using great-circle distance across 66 populations from the 1000 Genomes Project and Human Genome Diversity Project (HGDP), we test whether Neanderthal- and Denisovan-segment profile similarity declines with distance, whether any population pair is a false-discovery-rate-supported residual outlier, and whether a prespecified interval centered on the ABO blood-group locus, chosen because ABO has an unusually deep allelic history and has motivated founder-effect and archaic-background hypotheses (Segurel et al. 2012; Calafell et al. 2008; Halverson and Bolnick 2008; Condemi et al. 2021), shows anything beyond the genome-wide expectation. Robustness to alternative windows, similarity metrics, sample-size thresholds, datasets, co-located pairs, and regional omission is assessed throughout. The focal ABO analysis is prespecified as exploratory and is not used to infer a migration route.</w:t>
+        <w:t>We build such a baseline and use it as a well-powered negative test of two recurring claims: that particular population pairs share an exceptional excess of archaic segments, and that a focal locus such as ABO marks a specific migration route. A clearly framed negative result under dependence-aware inference is itself informative, because it sets the genome-wide expectation that any positive focal-locus or special-connection claim must exceed. Using great-circle distance across 66 populations from the 1000 Genomes Project and Human Genome Diversity Project (HGDP), we test whether Neanderthal- and Denisovan-segment profile similarity declines with distance, whether any population pair is a false-discovery-rate-supported residual outlier, and whether a prespecified interval centered on the ABO blood-group locus, chosen because ABO has an unusually deep allelic history and has motivated founder-effect and archaic-background hypotheses (Segurel et al. 2012; Calafell et al. 2008; Halverson and Bolnick 2008; Condemi et al. 2021), shows anything beyond the genome-wide expectation. Robustness to alternative windows, similarity metrics, sample-size thresholds, datasets, co-located pairs, and regional omission is assessed throughout. The focal ABO analysis is prespecified as exploratory and is not used to infer a migration route.</w:t>
       </w:r>
     </w:p>
     <w:p>
@@ -294,7 +294,7 @@
           <w:i w:val="0"/>
           <w:sz w:val="24"/>
         </w:rPr>
-        <w:t>Outlier analysis was restricted to the complete matrix after removing PUR, CLM, MXL, and PEL. Similarity was modeled using distance, same-continent status, and same-dataset status. Positive residuals were standardized by the residual standard deviation. For every pair, a one-sided nominal P value was calculated from its own residual null distribution across 9,999 population-label permutations. The Benjamini-Hochberg procedure was applied jointly to all non-admixed pairs within each ancestry analysis to control the false discovery rate (FDR) (Benjamini and Hochberg 1995). A supported positive outlier required z&gt;2 and q&lt;0.10.</w:t>
+        <w:t>Outlier analysis was restricted to the complete matrix after removing PUR, CLM, MXL, and PEL. Similarity was modeled using distance, same-continent status, and same-dataset status. Positive residuals were standardized by the residual standard deviation. For every pair, a one-sided nominal P value was calculated from its own residual null distribution across 9,999 population-label permutations. Because pair residuals are dyadically dependent, this null was generated by the same joint row-and-column population-label permutation used for the coefficient tests rather than by row-wise resampling, following the rationale for multiple-regression quadratic assignment with dependent dyads (Dekker, Krackhardt, and Snijders 2007). The Benjamini-Hochberg procedure was applied jointly to all non-admixed pairs within each ancestry analysis to control the false discovery rate (FDR) (Benjamini and Hochberg 1995). A supported positive outlier required z&gt;2 and q&lt;0.10.</w:t>
       </w:r>
     </w:p>
     <w:p>
@@ -504,7 +504,7 @@
         <w:pStyle w:val="Heading2"/>
       </w:pPr>
       <w:r>
-        <w:t>Secondary ABO-window observations</w:t>
+        <w:t>Prespecified ABO-window check</w:t>
       </w:r>
     </w:p>
     <w:p>
@@ -517,7 +517,7 @@
           <w:i w:val="0"/>
           <w:sz w:val="24"/>
         </w:rPr>
-        <w:t>The 500-kb ABO-centered scan identified 834 Neanderthal or Both source segments, of which 129 overlapped the ABO gene. Of the 834 interval segments, 247 had tied maximum reference similarity and were not forced to a lineage. In the Indigenous American HGDP subset, one Pima segment overlapped ABO and one Maya segment lay downstream within the wider interval. Both were Vindija-closest, but two segments among 41 represented individuals do not support a regional proportion or migration-route inference (Figure 5; Table 2).</w:t>
+        <w:t>As a prespecified focal-locus check, the 500-kb ABO-centered scan identified 834 Neanderthal or Both source segments, of which 129 overlapped the ABO gene and 247 were tied for maximum reference similarity. In the Indigenous American HGDP subset only two segments among 41 represented individuals fell in the interval. Consistent with the genome-wide result, this focal scan produced no route-level signal; exploratory segment-level compositions and counts are provided as Supplementary material (Figure S2; Table S1) and are not interpreted as regional proportions or migration routes.</w:t>
       </w:r>
     </w:p>
     <w:p>
@@ -525,7 +525,7 @@
         <w:pStyle w:val="Heading2"/>
       </w:pPr>
       <w:r>
-        <w:t>Contextual and schematic displays</w:t>
+        <w:t>Contextual displays</w:t>
       </w:r>
     </w:p>
     <w:p>
@@ -538,7 +538,7 @@
           <w:i w:val="0"/>
           <w:sz w:val="24"/>
         </w:rPr>
-        <w:t>Several contextual and schematic displays are provided as supplementary figures because they do not derive from the pairwise analysis. A Minard-style schematic places the analysis within broad dispersal and archaic-introgression contexts, with illustrative band widths and event placement (Figure S2). The O2-defining allele and ABO-window carrier summaries use different sources and are displayed descriptively rather than as an association analysis (Figure S3). An Ancient North Eurasian pathway is retained as a testable contextual hypothesis, not a route inferred from the two Indigenous American segment records (Figure S4). Ancient and modern ABO-window observations were produced by different pipelines and permit no formal temporal comparison (Figure S5). A bivariate global map summarising each population's mean Neanderthal and Denisovan segment coverage from the present profiles provides broad geographic context and was not used in the statistical models (Figure S6).</w:t>
+        <w:t>Several descriptive context panels are provided as supplementary figures because they do not derive from the pairwise analysis. The O2-defining allele and ABO-window carrier summaries use different sources and are displayed descriptively rather than as an association analysis (Figure S3). Ancient and modern ABO-window observations were produced by different pipelines and permit no formal temporal comparison (Figure S4). A bivariate global map summarising each population's mean Neanderthal and Denisovan segment coverage from the present profiles provides broad geographic context and was not used in the statistical models (Figure S5).</w:t>
       </w:r>
     </w:p>
     <w:p>
@@ -1085,20 +1085,6 @@
     </w:p>
     <w:p>
       <w:pPr>
-        <w:spacing w:line="360" w:lineRule="auto" w:after="160"/>
-      </w:pPr>
-      <w:r>
-        <w:rPr>
-          <w:b/>
-        </w:rPr>
-        <w:t xml:space="preserve">Figure 5. </w:t>
-      </w:r>
-      <w:r>
-        <w:t>ABO-centered analysis preserving the historical grouped-bar and segment-map layout. Equal maximum-similarity ties are excluded from the displayed three-reference proportions and retained in Supplementary Data. The Pima segment overlaps ABO; the Maya segment is within the wider interval but does not overlap the gene. Counts are segments, not regional frequencies.</w:t>
-      </w:r>
-    </w:p>
-    <w:p>
-      <w:pPr>
         <w:pStyle w:val="Heading1"/>
       </w:pPr>
       <w:r>
@@ -1130,7 +1116,7 @@
         <w:t xml:space="preserve">Figure S2. </w:t>
       </w:r>
       <w:r>
-        <w:t>Minard-style schematic of human dispersal and archaic introgression. Band widths, branch positions, and event placement are illustrative and do not estimate migration magnitude or a route supported by the present analysis. The ABO sub-lineage compositions shown are computed in this study from data/abo_sublineage_summary.csv (segments, not individuals; ties excluded from the percentages) and the South Asian Denisovan-segment count from data/abo_denisovan_segments.csv; broad archaic-ancestry ranges are attributed on the figure to Prüfer et al. (2014), Vernot and Akey (2014), Reich et al. (2011), and Meyer et al. (2012).</w:t>
+        <w:t>Exploratory ABO-centered analysis preserving the historical grouped-bar and segment-map layout. Equal maximum-similarity ties are excluded from the displayed three-reference proportions and retained in Supplementary Data. The Pima segment overlaps ABO; the Maya segment is within the wider interval but does not overlap the gene. Counts are segments, not regional frequencies, and are not interpreted as a migration route.</w:t>
       </w:r>
     </w:p>
     <w:p>
@@ -1158,7 +1144,7 @@
         <w:t xml:space="preserve">Figure S4. </w:t>
       </w:r>
       <w:r>
-        <w:t>Ancient North Eurasian contextual hypothesis. Dashed arrows represent a testable narrative, not evidence that either observed segment followed the illustrated route.</w:t>
+        <w:t>Descriptive ancient and modern ABO-window summaries generated by different pipelines; no formal temporal comparison is made.</w:t>
       </w:r>
     </w:p>
     <w:p>
@@ -1170,20 +1156,6 @@
           <w:b/>
         </w:rPr>
         <w:t xml:space="preserve">Figure S5. </w:t>
-      </w:r>
-      <w:r>
-        <w:t>Descriptive ancient and modern ABO-window summaries generated by different pipelines; no formal temporal comparison is made.</w:t>
-      </w:r>
-    </w:p>
-    <w:p>
-      <w:pPr>
-        <w:spacing w:line="360" w:lineRule="auto" w:after="160"/>
-      </w:pPr>
-      <w:r>
-        <w:rPr>
-          <w:b/>
-        </w:rPr>
-        <w:t xml:space="preserve">Figure S6. </w:t>
       </w:r>
       <w:r>
         <w:t>Bivariate global context computed in this study. Circle area encodes the mean per-bin Neanderthal-segment coverage and colour encodes the mean per-bin Denisovan-segment coverage for each population, both from data/population_profiles_500kb.npz; coordinates are approximate sampling locations from data/population_metadata.csv. These descriptive summaries were not used in the pairwise statistical models.</w:t>

</xml_diff>